<commit_message>
Site updated: 2022-05-10 07:57:00
</commit_message>
<xml_diff>
--- a/treasure/download/经藏/宝积部-65部/佛说无量寿经-曹魏-康僧铠.docx
+++ b/treasure/download/经藏/宝积部-65部/佛说无量寿经-曹魏-康僧铠.docx
@@ -732,178 +732,358 @@
           <w:szCs w:val="24"/>
           <w:shd w:val="pct15" w:color="auto" w:fill="FFFFFF"/>
         </w:rPr>
-        <w:t xml:space="preserve">　　设我得佛。国中人天。寿终之后复更三恶道者。不取正觉。</w:t>
-      </w:r>
-    </w:p>
-    <w:p>
-      <w:pPr>
-        <w:rPr>
-          <w:rFonts w:ascii="楷体" w:eastAsia="楷体" w:hAnsi="楷体"/>
-          <w:sz w:val="24"/>
-          <w:szCs w:val="24"/>
-          <w:shd w:val="pct15" w:color="auto" w:fill="FFFFFF"/>
-        </w:rPr>
-      </w:pPr>
-      <w:r>
-        <w:rPr>
-          <w:rFonts w:ascii="楷体" w:eastAsia="楷体" w:hAnsi="楷体" w:hint="eastAsia"/>
-          <w:sz w:val="24"/>
-          <w:szCs w:val="24"/>
-          <w:shd w:val="pct15" w:color="auto" w:fill="FFFFFF"/>
-        </w:rPr>
-        <w:t xml:space="preserve">　　设我得佛。国中人天。不悉真金色者。不取正觉。</w:t>
-      </w:r>
-    </w:p>
-    <w:p>
-      <w:pPr>
-        <w:rPr>
-          <w:rFonts w:ascii="楷体" w:eastAsia="楷体" w:hAnsi="楷体"/>
-          <w:sz w:val="24"/>
-          <w:szCs w:val="24"/>
-          <w:shd w:val="pct15" w:color="auto" w:fill="FFFFFF"/>
-        </w:rPr>
-      </w:pPr>
-      <w:r>
-        <w:rPr>
-          <w:rFonts w:ascii="楷体" w:eastAsia="楷体" w:hAnsi="楷体" w:hint="eastAsia"/>
-          <w:sz w:val="24"/>
-          <w:szCs w:val="24"/>
-          <w:shd w:val="pct15" w:color="auto" w:fill="FFFFFF"/>
-        </w:rPr>
-        <w:t xml:space="preserve">　　设我得佛。国中人天。形色不同，有好丑者。不取正觉。</w:t>
-      </w:r>
-    </w:p>
-    <w:p>
-      <w:pPr>
-        <w:rPr>
-          <w:rFonts w:ascii="楷体" w:eastAsia="楷体" w:hAnsi="楷体"/>
-          <w:sz w:val="24"/>
-          <w:szCs w:val="24"/>
-          <w:shd w:val="pct15" w:color="auto" w:fill="FFFFFF"/>
-        </w:rPr>
-      </w:pPr>
-      <w:r>
-        <w:rPr>
-          <w:rFonts w:ascii="楷体" w:eastAsia="楷体" w:hAnsi="楷体" w:hint="eastAsia"/>
-          <w:sz w:val="24"/>
-          <w:szCs w:val="24"/>
-          <w:shd w:val="pct15" w:color="auto" w:fill="FFFFFF"/>
-        </w:rPr>
-        <w:t xml:space="preserve">　　设我得佛。国中人天。不悉识宿命。下至知百千亿那由他诸劫事者。不取正觉。</w:t>
-      </w:r>
-    </w:p>
-    <w:p>
-      <w:pPr>
-        <w:rPr>
-          <w:rFonts w:ascii="楷体" w:eastAsia="楷体" w:hAnsi="楷体"/>
-          <w:sz w:val="24"/>
-          <w:szCs w:val="24"/>
-          <w:shd w:val="pct15" w:color="auto" w:fill="FFFFFF"/>
-        </w:rPr>
-      </w:pPr>
-      <w:r>
-        <w:rPr>
-          <w:rFonts w:ascii="楷体" w:eastAsia="楷体" w:hAnsi="楷体" w:hint="eastAsia"/>
-          <w:sz w:val="24"/>
-          <w:szCs w:val="24"/>
-          <w:shd w:val="pct15" w:color="auto" w:fill="FFFFFF"/>
-        </w:rPr>
-        <w:t xml:space="preserve">　　设我得佛。国中人天。不得天眼。下至见百千亿那由他诸佛国者。不取正觉。</w:t>
-      </w:r>
-    </w:p>
-    <w:p>
-      <w:pPr>
-        <w:rPr>
-          <w:rFonts w:ascii="楷体" w:eastAsia="楷体" w:hAnsi="楷体"/>
-          <w:sz w:val="24"/>
-          <w:szCs w:val="24"/>
-          <w:shd w:val="pct15" w:color="auto" w:fill="FFFFFF"/>
-        </w:rPr>
-      </w:pPr>
-      <w:r>
-        <w:rPr>
-          <w:rFonts w:ascii="楷体" w:eastAsia="楷体" w:hAnsi="楷体" w:hint="eastAsia"/>
-          <w:sz w:val="24"/>
-          <w:szCs w:val="24"/>
-          <w:shd w:val="pct15" w:color="auto" w:fill="FFFFFF"/>
-        </w:rPr>
-        <w:t xml:space="preserve">　　设我得佛。国中人天。不得天耳。下至闻百千亿那由他诸佛所说。不悉受持者。不取正觉。</w:t>
-      </w:r>
-    </w:p>
-    <w:p>
-      <w:pPr>
-        <w:rPr>
-          <w:rFonts w:ascii="楷体" w:eastAsia="楷体" w:hAnsi="楷体"/>
-          <w:sz w:val="24"/>
-          <w:szCs w:val="24"/>
-          <w:shd w:val="pct15" w:color="auto" w:fill="FFFFFF"/>
-        </w:rPr>
-      </w:pPr>
-      <w:r>
-        <w:rPr>
-          <w:rFonts w:ascii="楷体" w:eastAsia="楷体" w:hAnsi="楷体" w:hint="eastAsia"/>
-          <w:sz w:val="24"/>
-          <w:szCs w:val="24"/>
-          <w:shd w:val="pct15" w:color="auto" w:fill="FFFFFF"/>
-        </w:rPr>
-        <w:t xml:space="preserve">　　设我得佛。国中人天。不得见他心智。下至知百千亿那由他诸佛国中众生心念者。不取正觉。</w:t>
-      </w:r>
-    </w:p>
-    <w:p>
-      <w:pPr>
-        <w:rPr>
-          <w:rFonts w:ascii="楷体" w:eastAsia="楷体" w:hAnsi="楷体"/>
-          <w:sz w:val="24"/>
-          <w:szCs w:val="24"/>
-          <w:shd w:val="pct15" w:color="auto" w:fill="FFFFFF"/>
-        </w:rPr>
-      </w:pPr>
-      <w:r>
-        <w:rPr>
-          <w:rFonts w:ascii="楷体" w:eastAsia="楷体" w:hAnsi="楷体" w:hint="eastAsia"/>
-          <w:sz w:val="24"/>
-          <w:szCs w:val="24"/>
-          <w:shd w:val="pct15" w:color="auto" w:fill="FFFFFF"/>
-        </w:rPr>
-        <w:t xml:space="preserve">　　设我得佛。国中人天。不得神足。于一念顷，下至不能超过百千亿那由他诸佛国者。不取正觉。</w:t>
-      </w:r>
-    </w:p>
-    <w:p>
-      <w:pPr>
-        <w:rPr>
-          <w:rFonts w:ascii="楷体" w:eastAsia="楷体" w:hAnsi="楷体"/>
-          <w:sz w:val="24"/>
-          <w:szCs w:val="24"/>
-          <w:shd w:val="pct15" w:color="auto" w:fill="FFFFFF"/>
-        </w:rPr>
-      </w:pPr>
-      <w:r>
-        <w:rPr>
-          <w:rFonts w:ascii="楷体" w:eastAsia="楷体" w:hAnsi="楷体" w:hint="eastAsia"/>
-          <w:sz w:val="24"/>
-          <w:szCs w:val="24"/>
-          <w:shd w:val="pct15" w:color="auto" w:fill="FFFFFF"/>
-        </w:rPr>
-        <w:t xml:space="preserve">　　设我得佛。国中人天。若起想念贪计身者。不取正觉。</w:t>
-      </w:r>
-    </w:p>
-    <w:p>
-      <w:pPr>
-        <w:rPr>
-          <w:rFonts w:ascii="楷体" w:eastAsia="楷体" w:hAnsi="楷体"/>
-          <w:sz w:val="24"/>
-          <w:szCs w:val="24"/>
-          <w:shd w:val="pct15" w:color="auto" w:fill="FFFFFF"/>
-        </w:rPr>
-      </w:pPr>
-      <w:r>
-        <w:rPr>
-          <w:rFonts w:ascii="楷体" w:eastAsia="楷体" w:hAnsi="楷体" w:hint="eastAsia"/>
-          <w:sz w:val="24"/>
-          <w:szCs w:val="24"/>
-          <w:shd w:val="pct15" w:color="auto" w:fill="FFFFFF"/>
-        </w:rPr>
-        <w:t xml:space="preserve">　　设我得佛。国中人天。不住定聚。必至灭度者。不取正觉。</w:t>
+        <w:t xml:space="preserve">　　设我得佛。</w:t>
+      </w:r>
+      <w:r>
+        <w:rPr>
+          <w:rFonts w:ascii="楷体" w:eastAsia="楷体" w:hAnsi="楷体" w:hint="eastAsia"/>
+          <w:sz w:val="24"/>
+          <w:szCs w:val="24"/>
+          <w:shd w:val="pct15" w:color="auto" w:fill="FFFFFF"/>
+        </w:rPr>
+        <w:t>国中人天</w:t>
+      </w:r>
+      <w:r>
+        <w:rPr>
+          <w:rFonts w:ascii="楷体" w:eastAsia="楷体" w:hAnsi="楷体" w:hint="eastAsia"/>
+          <w:sz w:val="24"/>
+          <w:szCs w:val="24"/>
+          <w:shd w:val="pct15" w:color="auto" w:fill="FFFFFF"/>
+        </w:rPr>
+        <w:t>寿终之后复更三恶道者。不取正觉。</w:t>
+      </w:r>
+    </w:p>
+    <w:p>
+      <w:pPr>
+        <w:rPr>
+          <w:rFonts w:ascii="楷体" w:eastAsia="楷体" w:hAnsi="楷体"/>
+          <w:sz w:val="24"/>
+          <w:szCs w:val="24"/>
+          <w:shd w:val="pct15" w:color="auto" w:fill="FFFFFF"/>
+        </w:rPr>
+      </w:pPr>
+      <w:r>
+        <w:rPr>
+          <w:rFonts w:ascii="楷体" w:eastAsia="楷体" w:hAnsi="楷体" w:hint="eastAsia"/>
+          <w:sz w:val="24"/>
+          <w:szCs w:val="24"/>
+          <w:shd w:val="pct15" w:color="auto" w:fill="FFFFFF"/>
+        </w:rPr>
+        <w:t xml:space="preserve">　　设我得佛。</w:t>
+      </w:r>
+      <w:r>
+        <w:rPr>
+          <w:rFonts w:ascii="楷体" w:eastAsia="楷体" w:hAnsi="楷体" w:hint="eastAsia"/>
+          <w:sz w:val="24"/>
+          <w:szCs w:val="24"/>
+          <w:shd w:val="pct15" w:color="auto" w:fill="FFFFFF"/>
+        </w:rPr>
+        <w:t>国中人天</w:t>
+      </w:r>
+      <w:r>
+        <w:rPr>
+          <w:rFonts w:ascii="楷体" w:eastAsia="楷体" w:hAnsi="楷体" w:hint="eastAsia"/>
+          <w:sz w:val="24"/>
+          <w:szCs w:val="24"/>
+          <w:shd w:val="pct15" w:color="auto" w:fill="FFFFFF"/>
+        </w:rPr>
+        <w:t>不悉真金色者。不取正觉。</w:t>
+      </w:r>
+    </w:p>
+    <w:p>
+      <w:pPr>
+        <w:rPr>
+          <w:rFonts w:ascii="楷体" w:eastAsia="楷体" w:hAnsi="楷体"/>
+          <w:sz w:val="24"/>
+          <w:szCs w:val="24"/>
+          <w:shd w:val="pct15" w:color="auto" w:fill="FFFFFF"/>
+        </w:rPr>
+      </w:pPr>
+      <w:r>
+        <w:rPr>
+          <w:rFonts w:ascii="楷体" w:eastAsia="楷体" w:hAnsi="楷体" w:hint="eastAsia"/>
+          <w:sz w:val="24"/>
+          <w:szCs w:val="24"/>
+          <w:shd w:val="pct15" w:color="auto" w:fill="FFFFFF"/>
+        </w:rPr>
+        <w:t xml:space="preserve">　　设我得佛。</w:t>
+      </w:r>
+      <w:r>
+        <w:rPr>
+          <w:rFonts w:ascii="楷体" w:eastAsia="楷体" w:hAnsi="楷体" w:hint="eastAsia"/>
+          <w:sz w:val="24"/>
+          <w:szCs w:val="24"/>
+          <w:shd w:val="pct15" w:color="auto" w:fill="FFFFFF"/>
+        </w:rPr>
+        <w:t>国中人天</w:t>
+      </w:r>
+      <w:r>
+        <w:rPr>
+          <w:rFonts w:ascii="楷体" w:eastAsia="楷体" w:hAnsi="楷体" w:hint="eastAsia"/>
+          <w:sz w:val="24"/>
+          <w:szCs w:val="24"/>
+          <w:shd w:val="pct15" w:color="auto" w:fill="FFFFFF"/>
+        </w:rPr>
+        <w:t>形色不同，有好丑者。不取正觉。</w:t>
+      </w:r>
+    </w:p>
+    <w:p>
+      <w:pPr>
+        <w:rPr>
+          <w:rFonts w:ascii="楷体" w:eastAsia="楷体" w:hAnsi="楷体"/>
+          <w:sz w:val="24"/>
+          <w:szCs w:val="24"/>
+          <w:shd w:val="pct15" w:color="auto" w:fill="FFFFFF"/>
+        </w:rPr>
+      </w:pPr>
+      <w:r>
+        <w:rPr>
+          <w:rFonts w:ascii="楷体" w:eastAsia="楷体" w:hAnsi="楷体" w:hint="eastAsia"/>
+          <w:sz w:val="24"/>
+          <w:szCs w:val="24"/>
+          <w:shd w:val="pct15" w:color="auto" w:fill="FFFFFF"/>
+        </w:rPr>
+        <w:t xml:space="preserve">　　设我得佛。</w:t>
+      </w:r>
+      <w:r>
+        <w:rPr>
+          <w:rFonts w:ascii="楷体" w:eastAsia="楷体" w:hAnsi="楷体" w:hint="eastAsia"/>
+          <w:sz w:val="24"/>
+          <w:szCs w:val="24"/>
+          <w:shd w:val="pct15" w:color="auto" w:fill="FFFFFF"/>
+        </w:rPr>
+        <w:t>国中人天</w:t>
+      </w:r>
+      <w:r>
+        <w:rPr>
+          <w:rFonts w:ascii="楷体" w:eastAsia="楷体" w:hAnsi="楷体" w:hint="eastAsia"/>
+          <w:sz w:val="24"/>
+          <w:szCs w:val="24"/>
+          <w:shd w:val="pct15" w:color="auto" w:fill="FFFFFF"/>
+        </w:rPr>
+        <w:t>不悉识宿命。下至知百千亿那由他诸劫事者。不取正觉。</w:t>
+      </w:r>
+    </w:p>
+    <w:p>
+      <w:pPr>
+        <w:rPr>
+          <w:rFonts w:ascii="楷体" w:eastAsia="楷体" w:hAnsi="楷体"/>
+          <w:sz w:val="24"/>
+          <w:szCs w:val="24"/>
+          <w:shd w:val="pct15" w:color="auto" w:fill="FFFFFF"/>
+        </w:rPr>
+      </w:pPr>
+      <w:r>
+        <w:rPr>
+          <w:rFonts w:ascii="楷体" w:eastAsia="楷体" w:hAnsi="楷体" w:hint="eastAsia"/>
+          <w:sz w:val="24"/>
+          <w:szCs w:val="24"/>
+          <w:shd w:val="pct15" w:color="auto" w:fill="FFFFFF"/>
+        </w:rPr>
+        <w:t xml:space="preserve">　　设我得佛。</w:t>
+      </w:r>
+      <w:r>
+        <w:rPr>
+          <w:rFonts w:ascii="楷体" w:eastAsia="楷体" w:hAnsi="楷体" w:hint="eastAsia"/>
+          <w:sz w:val="24"/>
+          <w:szCs w:val="24"/>
+          <w:shd w:val="pct15" w:color="auto" w:fill="FFFFFF"/>
+        </w:rPr>
+        <w:t>国中人天</w:t>
+      </w:r>
+      <w:r>
+        <w:rPr>
+          <w:rFonts w:ascii="楷体" w:eastAsia="楷体" w:hAnsi="楷体" w:hint="eastAsia"/>
+          <w:sz w:val="24"/>
+          <w:szCs w:val="24"/>
+          <w:shd w:val="pct15" w:color="auto" w:fill="FFFFFF"/>
+        </w:rPr>
+        <w:t>不得天眼。下至见百千亿那由他诸佛国者。不取正觉。</w:t>
+      </w:r>
+    </w:p>
+    <w:p>
+      <w:pPr>
+        <w:rPr>
+          <w:rFonts w:ascii="楷体" w:eastAsia="楷体" w:hAnsi="楷体"/>
+          <w:sz w:val="24"/>
+          <w:szCs w:val="24"/>
+          <w:shd w:val="pct15" w:color="auto" w:fill="FFFFFF"/>
+        </w:rPr>
+      </w:pPr>
+      <w:r>
+        <w:rPr>
+          <w:rFonts w:ascii="楷体" w:eastAsia="楷体" w:hAnsi="楷体" w:hint="eastAsia"/>
+          <w:sz w:val="24"/>
+          <w:szCs w:val="24"/>
+          <w:shd w:val="pct15" w:color="auto" w:fill="FFFFFF"/>
+        </w:rPr>
+        <w:t xml:space="preserve">　　设我得佛。</w:t>
+      </w:r>
+      <w:r>
+        <w:rPr>
+          <w:rFonts w:ascii="楷体" w:eastAsia="楷体" w:hAnsi="楷体" w:hint="eastAsia"/>
+          <w:sz w:val="24"/>
+          <w:szCs w:val="24"/>
+          <w:shd w:val="pct15" w:color="auto" w:fill="FFFFFF"/>
+        </w:rPr>
+        <w:t>国中人天</w:t>
+      </w:r>
+      <w:r>
+        <w:rPr>
+          <w:rFonts w:ascii="楷体" w:eastAsia="楷体" w:hAnsi="楷体" w:hint="eastAsia"/>
+          <w:sz w:val="24"/>
+          <w:szCs w:val="24"/>
+          <w:shd w:val="pct15" w:color="auto" w:fill="FFFFFF"/>
+        </w:rPr>
+        <w:t>不得天耳。下至闻百千亿那由他诸佛所说。不悉受持者。不取正觉。</w:t>
+      </w:r>
+    </w:p>
+    <w:p>
+      <w:pPr>
+        <w:rPr>
+          <w:rFonts w:ascii="楷体" w:eastAsia="楷体" w:hAnsi="楷体"/>
+          <w:sz w:val="24"/>
+          <w:szCs w:val="24"/>
+          <w:shd w:val="pct15" w:color="auto" w:fill="FFFFFF"/>
+        </w:rPr>
+      </w:pPr>
+      <w:r>
+        <w:rPr>
+          <w:rFonts w:ascii="楷体" w:eastAsia="楷体" w:hAnsi="楷体" w:hint="eastAsia"/>
+          <w:sz w:val="24"/>
+          <w:szCs w:val="24"/>
+          <w:shd w:val="pct15" w:color="auto" w:fill="FFFFFF"/>
+        </w:rPr>
+        <w:t xml:space="preserve">　　设我得佛。</w:t>
+      </w:r>
+      <w:r>
+        <w:rPr>
+          <w:rFonts w:ascii="楷体" w:eastAsia="楷体" w:hAnsi="楷体" w:hint="eastAsia"/>
+          <w:sz w:val="24"/>
+          <w:szCs w:val="24"/>
+          <w:shd w:val="pct15" w:color="auto" w:fill="FFFFFF"/>
+        </w:rPr>
+        <w:t>国中人天</w:t>
+      </w:r>
+      <w:r>
+        <w:rPr>
+          <w:rFonts w:ascii="楷体" w:eastAsia="楷体" w:hAnsi="楷体" w:hint="eastAsia"/>
+          <w:sz w:val="24"/>
+          <w:szCs w:val="24"/>
+          <w:shd w:val="pct15" w:color="auto" w:fill="FFFFFF"/>
+        </w:rPr>
+        <w:t>不得见他心智。下至知百千亿那由他诸佛国中众生心念者。不取正觉。</w:t>
+      </w:r>
+    </w:p>
+    <w:p>
+      <w:pPr>
+        <w:rPr>
+          <w:rFonts w:ascii="楷体" w:eastAsia="楷体" w:hAnsi="楷体"/>
+          <w:sz w:val="24"/>
+          <w:szCs w:val="24"/>
+          <w:shd w:val="pct15" w:color="auto" w:fill="FFFFFF"/>
+        </w:rPr>
+      </w:pPr>
+      <w:r>
+        <w:rPr>
+          <w:rFonts w:ascii="楷体" w:eastAsia="楷体" w:hAnsi="楷体" w:hint="eastAsia"/>
+          <w:sz w:val="24"/>
+          <w:szCs w:val="24"/>
+          <w:shd w:val="pct15" w:color="auto" w:fill="FFFFFF"/>
+        </w:rPr>
+        <w:t xml:space="preserve">　　设我得佛。</w:t>
+      </w:r>
+      <w:r>
+        <w:rPr>
+          <w:rFonts w:ascii="楷体" w:eastAsia="楷体" w:hAnsi="楷体" w:hint="eastAsia"/>
+          <w:sz w:val="24"/>
+          <w:szCs w:val="24"/>
+          <w:shd w:val="pct15" w:color="auto" w:fill="FFFFFF"/>
+        </w:rPr>
+        <w:t>国中人天</w:t>
+      </w:r>
+      <w:r>
+        <w:rPr>
+          <w:rFonts w:ascii="楷体" w:eastAsia="楷体" w:hAnsi="楷体" w:hint="eastAsia"/>
+          <w:sz w:val="24"/>
+          <w:szCs w:val="24"/>
+          <w:shd w:val="pct15" w:color="auto" w:fill="FFFFFF"/>
+        </w:rPr>
+        <w:t>不得神足。于一念顷，下至不能超过百千亿那由他诸佛国者。不取正觉。</w:t>
+      </w:r>
+    </w:p>
+    <w:p>
+      <w:pPr>
+        <w:rPr>
+          <w:rFonts w:ascii="楷体" w:eastAsia="楷体" w:hAnsi="楷体"/>
+          <w:sz w:val="24"/>
+          <w:szCs w:val="24"/>
+          <w:shd w:val="pct15" w:color="auto" w:fill="FFFFFF"/>
+        </w:rPr>
+      </w:pPr>
+      <w:r>
+        <w:rPr>
+          <w:rFonts w:ascii="楷体" w:eastAsia="楷体" w:hAnsi="楷体" w:hint="eastAsia"/>
+          <w:sz w:val="24"/>
+          <w:szCs w:val="24"/>
+          <w:shd w:val="pct15" w:color="auto" w:fill="FFFFFF"/>
+        </w:rPr>
+        <w:t xml:space="preserve">　　设我得佛。</w:t>
+      </w:r>
+      <w:r>
+        <w:rPr>
+          <w:rFonts w:ascii="楷体" w:eastAsia="楷体" w:hAnsi="楷体" w:hint="eastAsia"/>
+          <w:sz w:val="24"/>
+          <w:szCs w:val="24"/>
+          <w:shd w:val="pct15" w:color="auto" w:fill="FFFFFF"/>
+        </w:rPr>
+        <w:t>国中人天</w:t>
+      </w:r>
+      <w:r>
+        <w:rPr>
+          <w:rFonts w:ascii="楷体" w:eastAsia="楷体" w:hAnsi="楷体" w:hint="eastAsia"/>
+          <w:sz w:val="24"/>
+          <w:szCs w:val="24"/>
+          <w:shd w:val="pct15" w:color="auto" w:fill="FFFFFF"/>
+        </w:rPr>
+        <w:t>若起想念贪计身者。不取正觉。</w:t>
+      </w:r>
+    </w:p>
+    <w:p>
+      <w:pPr>
+        <w:rPr>
+          <w:rFonts w:ascii="楷体" w:eastAsia="楷体" w:hAnsi="楷体"/>
+          <w:sz w:val="24"/>
+          <w:szCs w:val="24"/>
+          <w:shd w:val="pct15" w:color="auto" w:fill="FFFFFF"/>
+        </w:rPr>
+      </w:pPr>
+      <w:r>
+        <w:rPr>
+          <w:rFonts w:ascii="楷体" w:eastAsia="楷体" w:hAnsi="楷体" w:hint="eastAsia"/>
+          <w:sz w:val="24"/>
+          <w:szCs w:val="24"/>
+          <w:shd w:val="pct15" w:color="auto" w:fill="FFFFFF"/>
+        </w:rPr>
+        <w:t xml:space="preserve">　　设我得佛。</w:t>
+      </w:r>
+      <w:r>
+        <w:rPr>
+          <w:rFonts w:ascii="楷体" w:eastAsia="楷体" w:hAnsi="楷体" w:hint="eastAsia"/>
+          <w:sz w:val="24"/>
+          <w:szCs w:val="24"/>
+          <w:shd w:val="pct15" w:color="auto" w:fill="FFFFFF"/>
+        </w:rPr>
+        <w:t>国中人天</w:t>
+      </w:r>
+      <w:r>
+        <w:rPr>
+          <w:rFonts w:ascii="楷体" w:eastAsia="楷体" w:hAnsi="楷体" w:hint="eastAsia"/>
+          <w:sz w:val="24"/>
+          <w:szCs w:val="24"/>
+          <w:shd w:val="pct15" w:color="auto" w:fill="FFFFFF"/>
+        </w:rPr>
+        <w:t>不住定聚。必至灭度者。不取正觉。</w:t>
       </w:r>
     </w:p>
     <w:p>
@@ -979,26 +1159,62 @@
           <w:szCs w:val="24"/>
           <w:shd w:val="pct15" w:color="auto" w:fill="FFFFFF"/>
         </w:rPr>
-        <w:t xml:space="preserve">　　设我得佛。国中人天。寿命无能限量。除其本愿修短自在。若不尔者。不取正觉。</w:t>
-      </w:r>
-    </w:p>
-    <w:p>
-      <w:pPr>
-        <w:rPr>
-          <w:rFonts w:ascii="楷体" w:eastAsia="楷体" w:hAnsi="楷体"/>
-          <w:sz w:val="24"/>
-          <w:szCs w:val="24"/>
-          <w:shd w:val="pct15" w:color="auto" w:fill="FFFFFF"/>
-        </w:rPr>
-      </w:pPr>
-      <w:r>
-        <w:rPr>
-          <w:rFonts w:ascii="楷体" w:eastAsia="楷体" w:hAnsi="楷体" w:hint="eastAsia"/>
-          <w:sz w:val="24"/>
-          <w:szCs w:val="24"/>
-          <w:shd w:val="pct15" w:color="auto" w:fill="FFFFFF"/>
-        </w:rPr>
-        <w:t xml:space="preserve">　　设我得佛。国中人天。乃至闻有不善名者。不取正觉。</w:t>
+        <w:t xml:space="preserve">　　设我得佛。</w:t>
+      </w:r>
+      <w:r>
+        <w:rPr>
+          <w:rFonts w:ascii="楷体" w:eastAsia="楷体" w:hAnsi="楷体" w:hint="eastAsia"/>
+          <w:sz w:val="24"/>
+          <w:szCs w:val="24"/>
+          <w:shd w:val="pct15" w:color="auto" w:fill="FFFFFF"/>
+        </w:rPr>
+        <w:t>国中人天</w:t>
+      </w:r>
+      <w:r>
+        <w:rPr>
+          <w:rFonts w:ascii="楷体" w:eastAsia="楷体" w:hAnsi="楷体" w:hint="eastAsia"/>
+          <w:sz w:val="24"/>
+          <w:szCs w:val="24"/>
+          <w:shd w:val="pct15" w:color="auto" w:fill="FFFFFF"/>
+        </w:rPr>
+        <w:t>寿命无能限量。除其本愿修短自在。若不尔者。不取正觉。</w:t>
+      </w:r>
+    </w:p>
+    <w:p>
+      <w:pPr>
+        <w:rPr>
+          <w:rFonts w:ascii="楷体" w:eastAsia="楷体" w:hAnsi="楷体"/>
+          <w:sz w:val="24"/>
+          <w:szCs w:val="24"/>
+          <w:shd w:val="pct15" w:color="auto" w:fill="FFFFFF"/>
+        </w:rPr>
+      </w:pPr>
+      <w:r>
+        <w:rPr>
+          <w:rFonts w:ascii="楷体" w:eastAsia="楷体" w:hAnsi="楷体" w:hint="eastAsia"/>
+          <w:sz w:val="24"/>
+          <w:szCs w:val="24"/>
+          <w:shd w:val="pct15" w:color="auto" w:fill="FFFFFF"/>
+        </w:rPr>
+        <w:t xml:space="preserve">　　设我得佛。</w:t>
+      </w:r>
+      <w:r>
+        <w:rPr>
+          <w:rFonts w:ascii="楷体" w:eastAsia="楷体" w:hAnsi="楷体" w:hint="eastAsia"/>
+          <w:sz w:val="24"/>
+          <w:szCs w:val="24"/>
+          <w:shd w:val="pct15" w:color="auto" w:fill="FFFFFF"/>
+        </w:rPr>
+        <w:t>国中人天</w:t>
+      </w:r>
+      <w:r>
+        <w:rPr>
+          <w:rFonts w:ascii="楷体" w:eastAsia="楷体" w:hAnsi="楷体" w:hint="eastAsia"/>
+          <w:sz w:val="24"/>
+          <w:szCs w:val="24"/>
+          <w:shd w:val="pct15" w:color="auto" w:fill="FFFFFF"/>
+        </w:rPr>
+        <w:t>乃至闻有不善名者。不取正觉。</w:t>
       </w:r>
     </w:p>
     <w:p>
@@ -1055,8 +1271,17 @@
           <w:szCs w:val="24"/>
           <w:shd w:val="pct15" w:color="auto" w:fill="FFFFFF"/>
         </w:rPr>
+        <w:t xml:space="preserve">　　设我得佛。十方众生发菩提心修诸功德。至心发愿欲生我国。临寿终时。假</w:t>
+      </w:r>
+      <w:r>
+        <w:rPr>
+          <w:rFonts w:ascii="楷体" w:eastAsia="楷体" w:hAnsi="楷体" w:hint="eastAsia"/>
+          <w:sz w:val="24"/>
+          <w:szCs w:val="24"/>
+          <w:shd w:val="pct15" w:color="auto" w:fill="FFFFFF"/>
+        </w:rPr>
         <w:lastRenderedPageBreak/>
-        <w:t xml:space="preserve">　　设我得佛。十方众生发菩提心修诸功德。至心发愿欲生我国。临寿终时。假令不与大众围绕现其人前者。不取正觉。</w:t>
+        <w:t>令不与大众围绕现其人前者。不取正觉。</w:t>
       </w:r>
     </w:p>
     <w:p>
@@ -1094,7 +1319,25 @@
           <w:szCs w:val="24"/>
           <w:shd w:val="pct15" w:color="auto" w:fill="FFFFFF"/>
         </w:rPr>
-        <w:t xml:space="preserve">　　设我得佛。国中人天。不悉成满三十二大人相者。不取正觉。</w:t>
+        <w:t xml:space="preserve">　　设我得佛。</w:t>
+      </w:r>
+      <w:r>
+        <w:rPr>
+          <w:rFonts w:ascii="楷体" w:eastAsia="楷体" w:hAnsi="楷体" w:hint="eastAsia"/>
+          <w:sz w:val="24"/>
+          <w:szCs w:val="24"/>
+          <w:shd w:val="pct15" w:color="auto" w:fill="FFFFFF"/>
+        </w:rPr>
+        <w:t>国中人天</w:t>
+      </w:r>
+      <w:r>
+        <w:rPr>
+          <w:rFonts w:ascii="楷体" w:eastAsia="楷体" w:hAnsi="楷体" w:hint="eastAsia"/>
+          <w:sz w:val="24"/>
+          <w:szCs w:val="24"/>
+          <w:shd w:val="pct15" w:color="auto" w:fill="FFFFFF"/>
+        </w:rPr>
+        <w:t>不悉成满三十二大人相者。不取正觉。</w:t>
       </w:r>
     </w:p>
     <w:p>
@@ -1132,26 +1375,62 @@
           <w:szCs w:val="24"/>
           <w:shd w:val="pct15" w:color="auto" w:fill="FFFFFF"/>
         </w:rPr>
-        <w:t xml:space="preserve">　　设我得佛。国中菩萨。承佛神力供养诸佛。一食之顷不能遍至无量无数亿那由他诸佛国者。不取正觉。</w:t>
-      </w:r>
-    </w:p>
-    <w:p>
-      <w:pPr>
-        <w:rPr>
-          <w:rFonts w:ascii="楷体" w:eastAsia="楷体" w:hAnsi="楷体"/>
-          <w:sz w:val="24"/>
-          <w:szCs w:val="24"/>
-          <w:shd w:val="pct15" w:color="auto" w:fill="FFFFFF"/>
-        </w:rPr>
-      </w:pPr>
-      <w:r>
-        <w:rPr>
-          <w:rFonts w:ascii="楷体" w:eastAsia="楷体" w:hAnsi="楷体" w:hint="eastAsia"/>
-          <w:sz w:val="24"/>
-          <w:szCs w:val="24"/>
-          <w:shd w:val="pct15" w:color="auto" w:fill="FFFFFF"/>
-        </w:rPr>
-        <w:t xml:space="preserve">　　设我得佛。国中菩萨。在诸佛前现其德本。诸所求欲供养之具。若不如意者。不取正觉。</w:t>
+        <w:t xml:space="preserve">　　设我得佛。</w:t>
+      </w:r>
+      <w:r>
+        <w:rPr>
+          <w:rFonts w:ascii="楷体" w:eastAsia="楷体" w:hAnsi="楷体" w:hint="eastAsia"/>
+          <w:sz w:val="24"/>
+          <w:szCs w:val="24"/>
+          <w:shd w:val="pct15" w:color="auto" w:fill="FFFFFF"/>
+        </w:rPr>
+        <w:t>国中菩萨</w:t>
+      </w:r>
+      <w:r>
+        <w:rPr>
+          <w:rFonts w:ascii="楷体" w:eastAsia="楷体" w:hAnsi="楷体" w:hint="eastAsia"/>
+          <w:sz w:val="24"/>
+          <w:szCs w:val="24"/>
+          <w:shd w:val="pct15" w:color="auto" w:fill="FFFFFF"/>
+        </w:rPr>
+        <w:t>承佛神力供养诸佛。一食之顷不能遍至无量无数亿那由他诸佛国者。不取正觉。</w:t>
+      </w:r>
+    </w:p>
+    <w:p>
+      <w:pPr>
+        <w:rPr>
+          <w:rFonts w:ascii="楷体" w:eastAsia="楷体" w:hAnsi="楷体"/>
+          <w:sz w:val="24"/>
+          <w:szCs w:val="24"/>
+          <w:shd w:val="pct15" w:color="auto" w:fill="FFFFFF"/>
+        </w:rPr>
+      </w:pPr>
+      <w:r>
+        <w:rPr>
+          <w:rFonts w:ascii="楷体" w:eastAsia="楷体" w:hAnsi="楷体" w:hint="eastAsia"/>
+          <w:sz w:val="24"/>
+          <w:szCs w:val="24"/>
+          <w:shd w:val="pct15" w:color="auto" w:fill="FFFFFF"/>
+        </w:rPr>
+        <w:t xml:space="preserve">　　设我得佛。</w:t>
+      </w:r>
+      <w:r>
+        <w:rPr>
+          <w:rFonts w:ascii="楷体" w:eastAsia="楷体" w:hAnsi="楷体" w:hint="eastAsia"/>
+          <w:sz w:val="24"/>
+          <w:szCs w:val="24"/>
+          <w:shd w:val="pct15" w:color="auto" w:fill="FFFFFF"/>
+        </w:rPr>
+        <w:t>国中菩萨</w:t>
+      </w:r>
+      <w:r>
+        <w:rPr>
+          <w:rFonts w:ascii="楷体" w:eastAsia="楷体" w:hAnsi="楷体" w:hint="eastAsia"/>
+          <w:sz w:val="24"/>
+          <w:szCs w:val="24"/>
+          <w:shd w:val="pct15" w:color="auto" w:fill="FFFFFF"/>
+        </w:rPr>
+        <w:t>在诸佛前现其德本。诸所求欲供养之具。若不如意者。不取正觉。</w:t>
       </w:r>
     </w:p>
     <w:p>
@@ -1208,64 +1487,136 @@
           <w:szCs w:val="24"/>
           <w:shd w:val="pct15" w:color="auto" w:fill="FFFFFF"/>
         </w:rPr>
-        <w:t xml:space="preserve">　　设我得佛。国中人天。一切万物严净光丽。形色殊特。穷微极妙无能称量。其诸众生乃至逮得天眼。有能明了辨其名数者。不取正觉。</w:t>
-      </w:r>
-    </w:p>
-    <w:p>
-      <w:pPr>
-        <w:rPr>
-          <w:rFonts w:ascii="楷体" w:eastAsia="楷体" w:hAnsi="楷体"/>
-          <w:sz w:val="24"/>
-          <w:szCs w:val="24"/>
-          <w:shd w:val="pct15" w:color="auto" w:fill="FFFFFF"/>
-        </w:rPr>
-      </w:pPr>
-      <w:r>
-        <w:rPr>
-          <w:rFonts w:ascii="楷体" w:eastAsia="楷体" w:hAnsi="楷体" w:hint="eastAsia"/>
-          <w:sz w:val="24"/>
-          <w:szCs w:val="24"/>
-          <w:shd w:val="pct15" w:color="auto" w:fill="FFFFFF"/>
-        </w:rPr>
-        <w:t xml:space="preserve">　　设我得佛。国中菩萨。乃至少功德者。不能知见其道场树无量光色高四百万里者。不取正觉。</w:t>
-      </w:r>
-    </w:p>
-    <w:p>
-      <w:pPr>
-        <w:rPr>
-          <w:rFonts w:ascii="楷体" w:eastAsia="楷体" w:hAnsi="楷体"/>
-          <w:sz w:val="24"/>
-          <w:szCs w:val="24"/>
-          <w:shd w:val="pct15" w:color="auto" w:fill="FFFFFF"/>
-        </w:rPr>
-      </w:pPr>
-      <w:r>
-        <w:rPr>
-          <w:rFonts w:ascii="楷体" w:eastAsia="楷体" w:hAnsi="楷体" w:hint="eastAsia"/>
-          <w:sz w:val="24"/>
-          <w:szCs w:val="24"/>
-          <w:shd w:val="pct15" w:color="auto" w:fill="FFFFFF"/>
-        </w:rPr>
-        <w:t xml:space="preserve">　　设我得佛。国中菩萨。若受读经法、讽诵持说而不得辩才智慧者。不取正觉。</w:t>
-      </w:r>
-    </w:p>
-    <w:p>
-      <w:pPr>
-        <w:rPr>
-          <w:rFonts w:ascii="楷体" w:eastAsia="楷体" w:hAnsi="楷体"/>
-          <w:sz w:val="24"/>
-          <w:szCs w:val="24"/>
-          <w:shd w:val="pct15" w:color="auto" w:fill="FFFFFF"/>
-        </w:rPr>
-      </w:pPr>
-      <w:r>
-        <w:rPr>
-          <w:rFonts w:ascii="楷体" w:eastAsia="楷体" w:hAnsi="楷体" w:hint="eastAsia"/>
-          <w:sz w:val="24"/>
-          <w:szCs w:val="24"/>
-          <w:shd w:val="pct15" w:color="auto" w:fill="FFFFFF"/>
-        </w:rPr>
-        <w:t xml:space="preserve">　　设我得佛。国中菩萨。智慧辩才若可限量者。不取正觉。</w:t>
+        <w:t xml:space="preserve">　　设我得佛。</w:t>
+      </w:r>
+      <w:r>
+        <w:rPr>
+          <w:rFonts w:ascii="楷体" w:eastAsia="楷体" w:hAnsi="楷体" w:hint="eastAsia"/>
+          <w:sz w:val="24"/>
+          <w:szCs w:val="24"/>
+          <w:shd w:val="pct15" w:color="auto" w:fill="FFFFFF"/>
+        </w:rPr>
+        <w:t>国中人天</w:t>
+      </w:r>
+      <w:r>
+        <w:rPr>
+          <w:rFonts w:ascii="楷体" w:eastAsia="楷体" w:hAnsi="楷体" w:hint="eastAsia"/>
+          <w:sz w:val="24"/>
+          <w:szCs w:val="24"/>
+          <w:shd w:val="pct15" w:color="auto" w:fill="FFFFFF"/>
+        </w:rPr>
+        <w:t>一切万物严净光丽。形色殊特。穷微极妙无能称量。其诸众生乃至逮得天眼。有能明了辨其名数者。不取正觉。</w:t>
+      </w:r>
+    </w:p>
+    <w:p>
+      <w:pPr>
+        <w:rPr>
+          <w:rFonts w:ascii="楷体" w:eastAsia="楷体" w:hAnsi="楷体"/>
+          <w:sz w:val="24"/>
+          <w:szCs w:val="24"/>
+          <w:shd w:val="pct15" w:color="auto" w:fill="FFFFFF"/>
+        </w:rPr>
+      </w:pPr>
+      <w:r>
+        <w:rPr>
+          <w:rFonts w:ascii="楷体" w:eastAsia="楷体" w:hAnsi="楷体" w:hint="eastAsia"/>
+          <w:sz w:val="24"/>
+          <w:szCs w:val="24"/>
+          <w:shd w:val="pct15" w:color="auto" w:fill="FFFFFF"/>
+        </w:rPr>
+        <w:t xml:space="preserve">　　设我得佛。</w:t>
+      </w:r>
+      <w:r>
+        <w:rPr>
+          <w:rFonts w:ascii="楷体" w:eastAsia="楷体" w:hAnsi="楷体" w:hint="eastAsia"/>
+          <w:sz w:val="24"/>
+          <w:szCs w:val="24"/>
+          <w:shd w:val="pct15" w:color="auto" w:fill="FFFFFF"/>
+        </w:rPr>
+        <w:t>国中菩萨</w:t>
+      </w:r>
+      <w:r>
+        <w:rPr>
+          <w:rFonts w:ascii="楷体" w:eastAsia="楷体" w:hAnsi="楷体" w:hint="eastAsia"/>
+          <w:sz w:val="24"/>
+          <w:szCs w:val="24"/>
+          <w:shd w:val="pct15" w:color="auto" w:fill="FFFFFF"/>
+        </w:rPr>
+        <w:t>乃至少功德者。不能知见其道场树无量光色高四百万里者。不取正觉。</w:t>
+      </w:r>
+    </w:p>
+    <w:p>
+      <w:pPr>
+        <w:rPr>
+          <w:rFonts w:ascii="楷体" w:eastAsia="楷体" w:hAnsi="楷体"/>
+          <w:sz w:val="24"/>
+          <w:szCs w:val="24"/>
+          <w:shd w:val="pct15" w:color="auto" w:fill="FFFFFF"/>
+        </w:rPr>
+      </w:pPr>
+      <w:r>
+        <w:rPr>
+          <w:rFonts w:ascii="楷体" w:eastAsia="楷体" w:hAnsi="楷体" w:hint="eastAsia"/>
+          <w:sz w:val="24"/>
+          <w:szCs w:val="24"/>
+          <w:shd w:val="pct15" w:color="auto" w:fill="FFFFFF"/>
+        </w:rPr>
+        <w:t xml:space="preserve">　　设我得佛。</w:t>
+      </w:r>
+      <w:r>
+        <w:rPr>
+          <w:rFonts w:ascii="楷体" w:eastAsia="楷体" w:hAnsi="楷体" w:hint="eastAsia"/>
+          <w:sz w:val="24"/>
+          <w:szCs w:val="24"/>
+          <w:shd w:val="pct15" w:color="auto" w:fill="FFFFFF"/>
+        </w:rPr>
+        <w:t>国中菩萨</w:t>
+      </w:r>
+      <w:r>
+        <w:rPr>
+          <w:rFonts w:ascii="楷体" w:eastAsia="楷体" w:hAnsi="楷体" w:hint="eastAsia"/>
+          <w:sz w:val="24"/>
+          <w:szCs w:val="24"/>
+          <w:shd w:val="pct15" w:color="auto" w:fill="FFFFFF"/>
+        </w:rPr>
+        <w:t>若受读经法、讽诵持说而不得辩才智慧者。不取正觉。</w:t>
+      </w:r>
+    </w:p>
+    <w:p>
+      <w:pPr>
+        <w:rPr>
+          <w:rFonts w:ascii="楷体" w:eastAsia="楷体" w:hAnsi="楷体"/>
+          <w:sz w:val="24"/>
+          <w:szCs w:val="24"/>
+          <w:shd w:val="pct15" w:color="auto" w:fill="FFFFFF"/>
+        </w:rPr>
+      </w:pPr>
+      <w:r>
+        <w:rPr>
+          <w:rFonts w:ascii="楷体" w:eastAsia="楷体" w:hAnsi="楷体" w:hint="eastAsia"/>
+          <w:sz w:val="24"/>
+          <w:szCs w:val="24"/>
+          <w:shd w:val="pct15" w:color="auto" w:fill="FFFFFF"/>
+        </w:rPr>
+        <w:t xml:space="preserve">　　设我得佛。</w:t>
+      </w:r>
+      <w:r>
+        <w:rPr>
+          <w:rFonts w:ascii="楷体" w:eastAsia="楷体" w:hAnsi="楷体" w:hint="eastAsia"/>
+          <w:sz w:val="24"/>
+          <w:szCs w:val="24"/>
+          <w:shd w:val="pct15" w:color="auto" w:fill="FFFFFF"/>
+        </w:rPr>
+        <w:t>国中菩萨</w:t>
+      </w:r>
+      <w:r>
+        <w:rPr>
+          <w:rFonts w:ascii="楷体" w:eastAsia="楷体" w:hAnsi="楷体" w:hint="eastAsia"/>
+          <w:sz w:val="24"/>
+          <w:szCs w:val="24"/>
+          <w:shd w:val="pct15" w:color="auto" w:fill="FFFFFF"/>
+        </w:rPr>
+        <w:t>智慧辩才若可限量者。不取正觉。</w:t>
       </w:r>
     </w:p>
     <w:p>
@@ -1417,45 +1768,101 @@
           <w:szCs w:val="24"/>
           <w:shd w:val="pct15" w:color="auto" w:fill="FFFFFF"/>
         </w:rPr>
-        <w:t xml:space="preserve">　　设我得佛。国中人天。欲得衣服随念即至。如佛所赞应法妙服自然在身。若有裁缝染治浣濯者。不取正觉。</w:t>
-      </w:r>
-    </w:p>
-    <w:p>
-      <w:pPr>
-        <w:rPr>
-          <w:rFonts w:ascii="楷体" w:eastAsia="楷体" w:hAnsi="楷体"/>
-          <w:sz w:val="24"/>
-          <w:szCs w:val="24"/>
-          <w:shd w:val="pct15" w:color="auto" w:fill="FFFFFF"/>
-        </w:rPr>
-      </w:pPr>
-      <w:r>
-        <w:rPr>
-          <w:rFonts w:ascii="楷体" w:eastAsia="楷体" w:hAnsi="楷体" w:hint="eastAsia"/>
-          <w:sz w:val="24"/>
-          <w:szCs w:val="24"/>
-          <w:shd w:val="pct15" w:color="auto" w:fill="FFFFFF"/>
-        </w:rPr>
-        <w:t xml:space="preserve">　　设我得佛。国中人天。所受快乐不如漏尽比丘者。不取正觉。</w:t>
-      </w:r>
-    </w:p>
-    <w:p>
-      <w:pPr>
-        <w:rPr>
-          <w:rFonts w:ascii="楷体" w:eastAsia="楷体" w:hAnsi="楷体"/>
-          <w:sz w:val="24"/>
-          <w:szCs w:val="24"/>
-          <w:shd w:val="pct15" w:color="auto" w:fill="FFFFFF"/>
-        </w:rPr>
-      </w:pPr>
-      <w:r>
-        <w:rPr>
-          <w:rFonts w:ascii="楷体" w:eastAsia="楷体" w:hAnsi="楷体" w:hint="eastAsia"/>
-          <w:sz w:val="24"/>
-          <w:szCs w:val="24"/>
-          <w:shd w:val="pct15" w:color="auto" w:fill="FFFFFF"/>
-        </w:rPr>
-        <w:t xml:space="preserve">　　设我得佛。国中菩萨。随意欲见十方无量严净佛土。应时如愿。于宝树中皆悉照见。犹如明镜睹其面像。若不尔者。不取正觉。</w:t>
+        <w:t xml:space="preserve">　　设我得佛。</w:t>
+      </w:r>
+      <w:r>
+        <w:rPr>
+          <w:rFonts w:ascii="楷体" w:eastAsia="楷体" w:hAnsi="楷体" w:hint="eastAsia"/>
+          <w:sz w:val="24"/>
+          <w:szCs w:val="24"/>
+          <w:shd w:val="pct15" w:color="auto" w:fill="FFFFFF"/>
+        </w:rPr>
+        <w:t>国中人天</w:t>
+      </w:r>
+      <w:r>
+        <w:rPr>
+          <w:rFonts w:ascii="楷体" w:eastAsia="楷体" w:hAnsi="楷体" w:hint="eastAsia"/>
+          <w:sz w:val="24"/>
+          <w:szCs w:val="24"/>
+          <w:shd w:val="pct15" w:color="auto" w:fill="FFFFFF"/>
+        </w:rPr>
+        <w:t>欲得衣服随念即至。如佛所赞应法妙服自然在身。若有裁缝染治浣濯者。不取正觉。</w:t>
+      </w:r>
+    </w:p>
+    <w:p>
+      <w:pPr>
+        <w:rPr>
+          <w:rFonts w:ascii="楷体" w:eastAsia="楷体" w:hAnsi="楷体"/>
+          <w:sz w:val="24"/>
+          <w:szCs w:val="24"/>
+          <w:shd w:val="pct15" w:color="auto" w:fill="FFFFFF"/>
+        </w:rPr>
+      </w:pPr>
+      <w:r>
+        <w:rPr>
+          <w:rFonts w:ascii="楷体" w:eastAsia="楷体" w:hAnsi="楷体" w:hint="eastAsia"/>
+          <w:sz w:val="24"/>
+          <w:szCs w:val="24"/>
+          <w:shd w:val="pct15" w:color="auto" w:fill="FFFFFF"/>
+        </w:rPr>
+        <w:t xml:space="preserve">　　设我得佛。</w:t>
+      </w:r>
+      <w:r>
+        <w:rPr>
+          <w:rFonts w:ascii="楷体" w:eastAsia="楷体" w:hAnsi="楷体" w:hint="eastAsia"/>
+          <w:sz w:val="24"/>
+          <w:szCs w:val="24"/>
+          <w:shd w:val="pct15" w:color="auto" w:fill="FFFFFF"/>
+        </w:rPr>
+        <w:t>国中人天</w:t>
+      </w:r>
+      <w:r>
+        <w:rPr>
+          <w:rFonts w:ascii="楷体" w:eastAsia="楷体" w:hAnsi="楷体" w:hint="eastAsia"/>
+          <w:sz w:val="24"/>
+          <w:szCs w:val="24"/>
+          <w:shd w:val="pct15" w:color="auto" w:fill="FFFFFF"/>
+        </w:rPr>
+        <w:t>所受快乐不如漏尽比丘者。不取正觉。</w:t>
+      </w:r>
+    </w:p>
+    <w:p>
+      <w:pPr>
+        <w:rPr>
+          <w:rFonts w:ascii="楷体" w:eastAsia="楷体" w:hAnsi="楷体"/>
+          <w:sz w:val="24"/>
+          <w:szCs w:val="24"/>
+          <w:shd w:val="pct15" w:color="auto" w:fill="FFFFFF"/>
+        </w:rPr>
+      </w:pPr>
+      <w:r>
+        <w:rPr>
+          <w:rFonts w:ascii="楷体" w:eastAsia="楷体" w:hAnsi="楷体" w:hint="eastAsia"/>
+          <w:sz w:val="24"/>
+          <w:szCs w:val="24"/>
+          <w:shd w:val="pct15" w:color="auto" w:fill="FFFFFF"/>
+        </w:rPr>
+        <w:t xml:space="preserve">　　设我得佛。</w:t>
+      </w:r>
+      <w:bookmarkStart w:id="0" w:name="_GoBack"/>
+      <w:r>
+        <w:rPr>
+          <w:rFonts w:ascii="楷体" w:eastAsia="楷体" w:hAnsi="楷体" w:hint="eastAsia"/>
+          <w:sz w:val="24"/>
+          <w:szCs w:val="24"/>
+          <w:shd w:val="pct15" w:color="auto" w:fill="FFFFFF"/>
+        </w:rPr>
+        <w:t>国中菩萨</w:t>
+      </w:r>
+      <w:bookmarkEnd w:id="0"/>
+      <w:r>
+        <w:rPr>
+          <w:rFonts w:ascii="楷体" w:eastAsia="楷体" w:hAnsi="楷体" w:hint="eastAsia"/>
+          <w:sz w:val="24"/>
+          <w:szCs w:val="24"/>
+          <w:shd w:val="pct15" w:color="auto" w:fill="FFFFFF"/>
+        </w:rPr>
+        <w:t>随意欲见十方无量严净佛土。应时如愿。于宝树中皆悉照见。犹如明镜睹其面像。若不尔者。不取正觉。</w:t>
       </w:r>
     </w:p>
     <w:p>
@@ -1493,8 +1900,18 @@
           <w:szCs w:val="24"/>
           <w:shd w:val="pct15" w:color="auto" w:fill="FFFFFF"/>
         </w:rPr>
-        <w:t xml:space="preserve">　　设我得佛。他方国土诸菩萨众。闻我名字。皆悉逮得清净解脱三昧。住是三</w:t>
-      </w:r>
+        <w:t xml:space="preserve">　　设我得佛。他方国土诸菩萨众。闻我名字。皆悉逮得清净解脱三昧。住是三昧，一发意顷，供养无量不可思议诸佛世尊而不失定意。若不尔者。不取正觉。</w:t>
+      </w:r>
+    </w:p>
+    <w:p>
+      <w:pPr>
+        <w:rPr>
+          <w:rFonts w:ascii="楷体" w:eastAsia="楷体" w:hAnsi="楷体"/>
+          <w:sz w:val="24"/>
+          <w:szCs w:val="24"/>
+          <w:shd w:val="pct15" w:color="auto" w:fill="FFFFFF"/>
+        </w:rPr>
+      </w:pPr>
       <w:r>
         <w:rPr>
           <w:rFonts w:ascii="楷体" w:eastAsia="楷体" w:hAnsi="楷体" w:hint="eastAsia"/>
@@ -1503,25 +1920,6 @@
           <w:shd w:val="pct15" w:color="auto" w:fill="FFFFFF"/>
         </w:rPr>
         <w:lastRenderedPageBreak/>
-        <w:t>昧，一发意顷，供养无量不可思议诸佛世尊而不失定意。若不尔者。不取正觉。</w:t>
-      </w:r>
-    </w:p>
-    <w:p>
-      <w:pPr>
-        <w:rPr>
-          <w:rFonts w:ascii="楷体" w:eastAsia="楷体" w:hAnsi="楷体"/>
-          <w:sz w:val="24"/>
-          <w:szCs w:val="24"/>
-          <w:shd w:val="pct15" w:color="auto" w:fill="FFFFFF"/>
-        </w:rPr>
-      </w:pPr>
-      <w:r>
-        <w:rPr>
-          <w:rFonts w:ascii="楷体" w:eastAsia="楷体" w:hAnsi="楷体" w:hint="eastAsia"/>
-          <w:sz w:val="24"/>
-          <w:szCs w:val="24"/>
-          <w:shd w:val="pct15" w:color="auto" w:fill="FFFFFF"/>
-        </w:rPr>
         <w:t xml:space="preserve">　　设我得佛。他方国土诸菩萨众。闻我名字。寿终之后生尊贵家。若不尔者。不取正觉。</w:t>
       </w:r>
     </w:p>
@@ -1579,7 +1977,25 @@
           <w:szCs w:val="24"/>
           <w:shd w:val="pct15" w:color="auto" w:fill="FFFFFF"/>
         </w:rPr>
-        <w:t xml:space="preserve">　　设我得佛。国中菩萨。随其志愿所欲闻法自然得闻。若不尔者。不取正觉。</w:t>
+        <w:t xml:space="preserve">　　设我得佛。</w:t>
+      </w:r>
+      <w:r>
+        <w:rPr>
+          <w:rFonts w:ascii="楷体" w:eastAsia="楷体" w:hAnsi="楷体" w:hint="eastAsia"/>
+          <w:sz w:val="24"/>
+          <w:szCs w:val="24"/>
+          <w:shd w:val="pct15" w:color="auto" w:fill="FFFFFF"/>
+        </w:rPr>
+        <w:t>国中菩萨</w:t>
+      </w:r>
+      <w:r>
+        <w:rPr>
+          <w:rFonts w:ascii="楷体" w:eastAsia="楷体" w:hAnsi="楷体" w:hint="eastAsia"/>
+          <w:sz w:val="24"/>
+          <w:szCs w:val="24"/>
+          <w:shd w:val="pct15" w:color="auto" w:fill="FFFFFF"/>
+        </w:rPr>
+        <w:t>随其志愿所欲闻法自然得闻。若不尔者。不取正觉。</w:t>
       </w:r>
     </w:p>
     <w:p>
@@ -1826,18 +2242,7 @@
           <w:szCs w:val="24"/>
           <w:shd w:val="pct15" w:color="auto" w:fill="FFFFFF"/>
         </w:rPr>
-        <w:t xml:space="preserve">　　如佛无量智　　通达靡不遍。</w:t>
-      </w:r>
-      <w:bookmarkStart w:id="0" w:name="_GoBack"/>
-      <w:bookmarkEnd w:id="0"/>
-      <w:r>
-        <w:rPr>
-          <w:rFonts w:ascii="楷体" w:eastAsia="楷体" w:hAnsi="楷体" w:hint="eastAsia"/>
-          <w:sz w:val="24"/>
-          <w:szCs w:val="24"/>
-          <w:shd w:val="pct15" w:color="auto" w:fill="FFFFFF"/>
-        </w:rPr>
-        <w:t>愿我功德力　　等此最胜尊。</w:t>
+        <w:t xml:space="preserve">　　如佛无量智　　通达靡不遍。愿我功德力　　等此最胜尊。</w:t>
       </w:r>
     </w:p>
     <w:p>
@@ -1970,7 +2375,7 @@
           <w:szCs w:val="24"/>
           <w:shd w:val="pct15" w:color="auto" w:fill="FFFFFF"/>
         </w:rPr>
-        <w:t xml:space="preserve">　　佛言。成佛已来凡历十劫。其佛国土自然七宝。金银琉璃珊瑚琥珀车磲玛瑙合成为地。恢廓旷荡不可限极。悉相杂厕转相入间。光赫焜耀微妙奇丽。清净庄</w:t>
+        <w:t xml:space="preserve">　　佛言。成佛已来凡历十劫。其佛国土自然七宝。金银琉璃珊瑚琥珀车磲玛瑙合成为地。恢廓旷荡不可限极。悉相杂厕转相入间。光赫焜耀微妙奇丽。清净庄严超逾十方一切世界。众宝中精。其宝犹如第六天宝。又其国土无须弥山及金刚</w:t>
       </w:r>
       <w:r>
         <w:rPr>
@@ -1980,7 +2385,7 @@
           <w:shd w:val="pct15" w:color="auto" w:fill="FFFFFF"/>
         </w:rPr>
         <w:lastRenderedPageBreak/>
-        <w:t>严超逾十方一切世界。众宝中精。其宝犹如第六天宝。又其国土无须弥山及金刚围一切诸山。亦无大海小海溪渠井谷。佛神力故欲见则见。亦无地狱饿鬼畜生诸难之趣。亦无四时春秋冬夏。不寒不热常和调适。</w:t>
+        <w:t>围一切诸山。亦无大海小海溪渠井谷。佛神力故欲见则见。亦无地狱饿鬼畜生诸难之趣。亦无四时春秋冬夏。不寒不热常和调适。</w:t>
       </w:r>
     </w:p>
     <w:p>
@@ -2189,7 +2594,7 @@
           <w:szCs w:val="24"/>
           <w:shd w:val="pct15" w:color="auto" w:fill="FFFFFF"/>
         </w:rPr>
-        <w:t xml:space="preserve">　　佛语阿难。如目连等。于百千万亿那由他劫计彼初会声闻菩萨。所知数者犹如一渧。其所不知如大海水。又其国土七宝诸树周满世界。金树银树琉璃树颇梨树珊瑚树玛瑙树车磲树。或有二宝三宝乃至七宝转共合成。或有金树银叶华果。或有银树金叶华果。或琉璃树玻梨为叶华果亦然。或水精树琉璃为叶华果亦然。或珊瑚树玛瑙为叶华果亦然。或玛瑙树琉璃为叶华果亦然。或车磲树众宝为叶华果亦然。或有宝树紫金为本白银为茎琉璃为枝水精为条珊瑚为叶玛瑙为华车磲为实。或有宝树白银为本琉璃为茎水精为枝珊瑚为条玛瑙为叶车磲为华紫金为实或有宝树琉璃为本水精为茎珊瑚为枝玛瑙为条车磲为叶紫金为华白银为实。或有宝树水精为本珊瑚为茎玛瑙为枝车磲为条紫金为叶白银为华琉璃为实。或有宝树珊瑚为本玛瑙为茎车磲为枝紫金为条白银为叶琉璃为华水精为实。或有宝树玛瑙为本车磲为茎紫金为枝白银为条琉璃为叶水精为华珊瑚为实。或有宝树车磲为本紫金为茎白银为枝琉璃为条水精为叶珊瑚为华玛瑙为实。行行相值。茎茎相望。枝枝相准。叶叶相向。华华相顺。实实相当。荣色光曜不可胜视。清风时发出五音</w:t>
+        <w:t xml:space="preserve">　　佛语阿难。如目连等。于百千万亿那由他劫计彼初会声闻菩萨。所知数者犹如一渧。其所不知如大海水。又其国土七宝诸树周满世界。金树银树琉璃树颇梨树珊瑚树玛瑙树车磲树。或有二宝三宝乃至七宝转共合成。或有金树银叶华果。或有银树金叶华果。或琉璃树玻梨为叶华果亦然。或水精树琉璃为叶华果亦然。或珊瑚树玛瑙为叶华果亦然。或玛瑙树琉璃为叶华果亦然。或车磲树众宝为叶华果亦然。或有宝树紫金为本白银为茎琉璃为枝水精为条珊瑚为叶玛瑙为华车磲为实。或有宝树白银为本琉璃为茎水精为枝珊瑚为条玛瑙为叶车磲为华紫金为实或有宝树琉璃为本水精为茎珊瑚为枝玛瑙为条车磲为叶紫金为华白银为实。或有宝树水精为本珊瑚为茎玛瑙为枝车磲为条紫金为叶白银为华琉璃为实。或有宝树珊瑚为本玛瑙为茎车磲为枝紫金为条白银为叶琉璃为华水精为实。或有宝树玛瑙为本车磲为茎紫金为枝白银为条琉璃为叶水精为华珊瑚为实。或有宝树车磲为本紫金为茎白银为枝琉璃为条水精为叶珊瑚为华玛瑙为实。行行相值。茎茎相望。枝枝相准。叶叶相向。华华相顺。实实相当。荣色光曜不可胜视。清风时发出五音声。微妙宫商自然相和。又无量寿佛其道场树高四百万里。其本周围五千由旬。</w:t>
       </w:r>
       <w:r>
         <w:rPr>
@@ -2199,7 +2604,7 @@
           <w:shd w:val="pct15" w:color="auto" w:fill="FFFFFF"/>
         </w:rPr>
         <w:lastRenderedPageBreak/>
-        <w:t>声。微妙宫商自然相和。又无量寿佛其道场树高四百万里。其本周围五千由旬。枝叶四布二十万里。一切众宝自然合成。以月光摩尼持海轮宝众宝之王而庄严之。周匝条间垂宝璎珞。百千万色种种异变。无量光炎照曜无极。珍妙宝网罗覆其上。一切庄严随应而现。微风徐动出妙法音。普流十方一切佛国。其闻音者得深法忍。住不退转至成佛道。不遭苦患。目睹其色。耳闻其音。鼻知其香。舌尝其味。身触其光。心以法缘。一切皆得甚深法忍。住不退转至成佛道。六根清彻无诸恼患。</w:t>
+        <w:t>枝叶四布二十万里。一切众宝自然合成。以月光摩尼持海轮宝众宝之王而庄严之。周匝条间垂宝璎珞。百千万色种种异变。无量光炎照曜无极。珍妙宝网罗覆其上。一切庄严随应而现。微风徐动出妙法音。普流十方一切佛国。其闻音者得深法忍。住不退转至成佛道。不遭苦患。目睹其色。耳闻其音。鼻知其香。舌尝其味。身触其光。心以法缘。一切皆得甚深法忍。住不退转至成佛道。六根清彻无诸恼患。</w:t>
       </w:r>
     </w:p>
     <w:p>
@@ -2313,8 +2718,17 @@
           <w:szCs w:val="24"/>
           <w:shd w:val="pct15" w:color="auto" w:fill="FFFFFF"/>
         </w:rPr>
+        <w:t xml:space="preserve">　　佛告阿难。汝言是也。计如帝王虽人中尊贵形色端正。比之转轮圣王甚为鄙</w:t>
+      </w:r>
+      <w:r>
+        <w:rPr>
+          <w:rFonts w:ascii="楷体" w:eastAsia="楷体" w:hAnsi="楷体" w:hint="eastAsia"/>
+          <w:sz w:val="24"/>
+          <w:szCs w:val="24"/>
+          <w:shd w:val="pct15" w:color="auto" w:fill="FFFFFF"/>
+        </w:rPr>
         <w:lastRenderedPageBreak/>
-        <w:t xml:space="preserve">　　佛告阿难。汝言是也。计如帝王虽人中尊贵形色端正。比之转轮圣王甚为鄙陋。犹彼乞人在帝王边。转轮圣王威相殊妙天下第一。比忉利天王又复丑恶不得相喻。万亿倍也。假令天帝比第六天王。百千亿倍不相类也。设第六天王比无量寿佛国菩萨声闻。光颜容色不相及逮。百千万亿不可计倍。</w:t>
+        <w:t>陋。犹彼乞人在帝王边。转轮圣王威相殊妙天下第一。比忉利天王又复丑恶不得相喻。万亿倍也。假令天帝比第六天王。百千亿倍不相类也。设第六天王比无量寿佛国菩萨声闻。光颜容色不相及逮。百千万亿不可计倍。</w:t>
       </w:r>
     </w:p>
     <w:p>
@@ -2552,26 +2966,26 @@
           <w:szCs w:val="24"/>
           <w:shd w:val="pct15" w:color="auto" w:fill="FFFFFF"/>
         </w:rPr>
+        <w:t xml:space="preserve">　　一切诸菩萨　　各赍天妙华。宝香无价衣　　供养无量觉。</w:t>
+      </w:r>
+    </w:p>
+    <w:p>
+      <w:pPr>
+        <w:rPr>
+          <w:rFonts w:ascii="楷体" w:eastAsia="楷体" w:hAnsi="楷体"/>
+          <w:sz w:val="24"/>
+          <w:szCs w:val="24"/>
+          <w:shd w:val="pct15" w:color="auto" w:fill="FFFFFF"/>
+        </w:rPr>
+      </w:pPr>
+      <w:r>
+        <w:rPr>
+          <w:rFonts w:ascii="楷体" w:eastAsia="楷体" w:hAnsi="楷体" w:hint="eastAsia"/>
+          <w:sz w:val="24"/>
+          <w:szCs w:val="24"/>
+          <w:shd w:val="pct15" w:color="auto" w:fill="FFFFFF"/>
+        </w:rPr>
         <w:lastRenderedPageBreak/>
-        <w:t xml:space="preserve">　　一切诸菩萨　　各赍天妙华。宝香无价衣　　供养无量觉。</w:t>
-      </w:r>
-    </w:p>
-    <w:p>
-      <w:pPr>
-        <w:rPr>
-          <w:rFonts w:ascii="楷体" w:eastAsia="楷体" w:hAnsi="楷体"/>
-          <w:sz w:val="24"/>
-          <w:szCs w:val="24"/>
-          <w:shd w:val="pct15" w:color="auto" w:fill="FFFFFF"/>
-        </w:rPr>
-      </w:pPr>
-      <w:r>
-        <w:rPr>
-          <w:rFonts w:ascii="楷体" w:eastAsia="楷体" w:hAnsi="楷体" w:hint="eastAsia"/>
-          <w:sz w:val="24"/>
-          <w:szCs w:val="24"/>
-          <w:shd w:val="pct15" w:color="auto" w:fill="FFFFFF"/>
-        </w:rPr>
         <w:t xml:space="preserve">　　咸然奏天乐　　畅发和雅音。歌叹最胜尊　　供养无量觉。</w:t>
       </w:r>
     </w:p>
@@ -3180,8 +3594,18 @@
           <w:szCs w:val="24"/>
           <w:shd w:val="pct15" w:color="auto" w:fill="FFFFFF"/>
         </w:rPr>
-        <w:t xml:space="preserve">　　佛语阿难。彼国菩萨承佛威神。一食之顷往诣十方无量世界。恭敬供养诸佛世尊。随心所念。华香伎乐缯盖幢幡无数无量供养之具自然化生应念即至。珍妙殊特非世所有。转以奉散诸佛菩萨声闻大众。在虚空中化成华盖。光色晃耀香气普熏。其华周圆四百里者。如是转倍。乃覆三千大千世界。随其前后以次化没。其诸菩萨佥然欣悦。于虚空中共奏天乐。以微妙音歌叹佛德。听受经法欢喜无量。</w:t>
-      </w:r>
+        <w:t xml:space="preserve">　　佛语阿难。彼国菩萨承佛威神。一食之顷往诣十方无量世界。恭敬供养诸佛世尊。随心所念。华香伎乐缯盖幢幡无数无量供养之具自然化生应念即至。珍妙殊特非世所有。转以奉散诸佛菩萨声闻大众。在虚空中化成华盖。光色晃耀香气普熏。其华周圆四百里者。如是转倍。乃覆三千大千世界。随其前后以次化没。其诸菩萨佥然欣悦。于虚空中共奏天乐。以微妙音歌叹佛德。听受经法欢喜无量。供养佛已。未食之前。忽然轻举还其本国。</w:t>
+      </w:r>
+    </w:p>
+    <w:p>
+      <w:pPr>
+        <w:rPr>
+          <w:rFonts w:ascii="楷体" w:eastAsia="楷体" w:hAnsi="楷体"/>
+          <w:sz w:val="24"/>
+          <w:szCs w:val="24"/>
+          <w:shd w:val="pct15" w:color="auto" w:fill="FFFFFF"/>
+        </w:rPr>
+      </w:pPr>
       <w:r>
         <w:rPr>
           <w:rFonts w:ascii="楷体" w:eastAsia="楷体" w:hAnsi="楷体" w:hint="eastAsia"/>
@@ -3190,25 +3614,6 @@
           <w:shd w:val="pct15" w:color="auto" w:fill="FFFFFF"/>
         </w:rPr>
         <w:lastRenderedPageBreak/>
-        <w:t>供养佛已。未食之前。忽然轻举还其本国。</w:t>
-      </w:r>
-    </w:p>
-    <w:p>
-      <w:pPr>
-        <w:rPr>
-          <w:rFonts w:ascii="楷体" w:eastAsia="楷体" w:hAnsi="楷体"/>
-          <w:sz w:val="24"/>
-          <w:szCs w:val="24"/>
-          <w:shd w:val="pct15" w:color="auto" w:fill="FFFFFF"/>
-        </w:rPr>
-      </w:pPr>
-      <w:r>
-        <w:rPr>
-          <w:rFonts w:ascii="楷体" w:eastAsia="楷体" w:hAnsi="楷体" w:hint="eastAsia"/>
-          <w:sz w:val="24"/>
-          <w:szCs w:val="24"/>
-          <w:shd w:val="pct15" w:color="auto" w:fill="FFFFFF"/>
-        </w:rPr>
         <w:t xml:space="preserve">　　佛语阿难。无量寿佛为诸声闻菩萨大众颁宣法时。都悉集会七宝讲堂。广宣道教演畅妙法。莫不欢喜心解得道。即时四方自然风起。普吹宝树出五音声。雨无量妙华随风周遍。自然供养如是不绝。一切诸天皆赍天上百千华香万种伎乐。供养其佛及诸菩萨声闻大众。普散华香奏诸音乐。前后来往更相开避。当斯之时。熙然快乐不可胜言。</w:t>
       </w:r>
     </w:p>
@@ -3380,7 +3785,7 @@
           <w:szCs w:val="24"/>
           <w:shd w:val="pct15" w:color="auto" w:fill="FFFFFF"/>
         </w:rPr>
-        <w:t xml:space="preserve">　　然世人薄俗。共诤不急之事。于此剧恶极苦之中。勤身营务以自给济。无尊无卑。无贫无富。少长男女共忧钱财。有无同然。忧思适等。屏营愁苦。累念积虑。为心走使无有安时。有田忧田。有宅忧宅。牛马六畜奴婢钱财衣食什物。复</w:t>
+        <w:t xml:space="preserve">　　然世人薄俗。共诤不急之事。于此剧恶极苦之中。勤身营务以自给济。无尊无卑。无贫无富。少长男女共忧钱财。有无同然。忧思适等。屏营愁苦。累念积虑。为心走使无有安时。有田忧田。有宅忧宅。牛马六畜奴婢钱财衣食什物。复共忧之。重思累息忧念愁怖。横为非常水火盗贼怨家债主。焚漂劫夺消散磨灭。</w:t>
       </w:r>
       <w:r>
         <w:rPr>
@@ -3390,7 +3795,7 @@
           <w:shd w:val="pct15" w:color="auto" w:fill="FFFFFF"/>
         </w:rPr>
         <w:lastRenderedPageBreak/>
-        <w:t>共忧之。重思累息忧念愁怖。横为非常水火盗贼怨家债主。焚漂劫夺消散磨灭。忧毒忪忪无有解时。结愤心中不离忧恼。心坚意固适无纵舍。或坐摧碎身亡命终。弃捐之去莫谁随者。尊贵豪富亦有斯患。忧惧万端勤苦若此。结众寒热与痛共俱。贫穷下劣困乏常无。无田亦忧欲有田。无宅亦忧欲有宅。无牛马六畜奴婢钱财衣食什物。亦忧欲有之。适有一复少一。有是少是。思有齐等。适欲具有便复糜散。如是忧苦当复求索。不能时得思想无益。身心俱劳坐起不安。忧念相随勤苦若此。亦结众寒热与痛共俱。或时坐之终身夭命。不肯为善行道进德。寿终身死当独远去。有所趣向善恶之道莫能知者。世间人民父子兄弟夫妇家室中外亲属。当相敬爱无相憎嫉。有无相通无得贪惜。言色常和莫相违戾。或时心诤有所恚怒。今世恨意微相憎嫉。后世转剧至成大怨。所以者何。世间之事更相患害。虽不即时应急相破。然含毒畜怒结愤精神。自然克识不得相离。皆当对生更相报复。</w:t>
+        <w:t>忧毒忪忪无有解时。结愤心中不离忧恼。心坚意固适无纵舍。或坐摧碎身亡命终。弃捐之去莫谁随者。尊贵豪富亦有斯患。忧惧万端勤苦若此。结众寒热与痛共俱。贫穷下劣困乏常无。无田亦忧欲有田。无宅亦忧欲有宅。无牛马六畜奴婢钱财衣食什物。亦忧欲有之。适有一复少一。有是少是。思有齐等。适欲具有便复糜散。如是忧苦当复求索。不能时得思想无益。身心俱劳坐起不安。忧念相随勤苦若此。亦结众寒热与痛共俱。或时坐之终身夭命。不肯为善行道进德。寿终身死当独远去。有所趣向善恶之道莫能知者。世间人民父子兄弟夫妇家室中外亲属。当相敬爱无相憎嫉。有无相通无得贪惜。言色常和莫相违戾。或时心诤有所恚怒。今世恨意微相憎嫉。后世转剧至成大怨。所以者何。世间之事更相患害。虽不即时应急相破。然含毒畜怒结愤精神。自然克识不得相离。皆当对生更相报复。</w:t>
       </w:r>
     </w:p>
     <w:p>
@@ -3599,8 +4004,18 @@
           <w:szCs w:val="24"/>
           <w:shd w:val="pct15" w:color="auto" w:fill="FFFFFF"/>
         </w:rPr>
-        <w:t xml:space="preserve">　　弥勒菩萨长跪白言。佛威神尊重。所说快善。听佛经者贯心思之。世人实尔如佛所言。今佛慈愍显示大道。耳目开明长得度脱。闻佛所说莫不欢喜。诸天人民蠕动之类。皆蒙慈恩解脱忧苦。佛语教诫甚深甚善。智慧明见八方上下。去来今事莫不究畅。今我众等所以蒙得度脱。皆佛前世求道之时谦苦所致。恩德普覆福禄巍巍。光明彻照达空无极开入泥洹。教授典揽威制消化。感动十方无穷无极。佛为法王尊超众圣。普为一切天人之师。随心所愿皆令得道。今得值佛。复闻无</w:t>
-      </w:r>
+        <w:t xml:space="preserve">　　弥勒菩萨长跪白言。佛威神尊重。所说快善。听佛经者贯心思之。世人实尔如佛所言。今佛慈愍显示大道。耳目开明长得度脱。闻佛所说莫不欢喜。诸天人民蠕动之类。皆蒙慈恩解脱忧苦。佛语教诫甚深甚善。智慧明见八方上下。去来今事莫不究畅。今我众等所以蒙得度脱。皆佛前世求道之时谦苦所致。恩德普覆福禄巍巍。光明彻照达空无极开入泥洹。教授典揽威制消化。感动十方无穷无极。佛为法王尊超众圣。普为一切天人之师。随心所愿皆令得道。今得值佛。复闻无量寿声。靡不欢喜心得开明。</w:t>
+      </w:r>
+    </w:p>
+    <w:p>
+      <w:pPr>
+        <w:rPr>
+          <w:rFonts w:ascii="楷体" w:eastAsia="楷体" w:hAnsi="楷体"/>
+          <w:sz w:val="24"/>
+          <w:szCs w:val="24"/>
+          <w:shd w:val="pct15" w:color="auto" w:fill="FFFFFF"/>
+        </w:rPr>
+      </w:pPr>
       <w:r>
         <w:rPr>
           <w:rFonts w:ascii="楷体" w:eastAsia="楷体" w:hAnsi="楷体" w:hint="eastAsia"/>
@@ -3609,25 +4024,6 @@
           <w:shd w:val="pct15" w:color="auto" w:fill="FFFFFF"/>
         </w:rPr>
         <w:lastRenderedPageBreak/>
-        <w:t>量寿声。靡不欢喜心得开明。</w:t>
-      </w:r>
-    </w:p>
-    <w:p>
-      <w:pPr>
-        <w:rPr>
-          <w:rFonts w:ascii="楷体" w:eastAsia="楷体" w:hAnsi="楷体"/>
-          <w:sz w:val="24"/>
-          <w:szCs w:val="24"/>
-          <w:shd w:val="pct15" w:color="auto" w:fill="FFFFFF"/>
-        </w:rPr>
-      </w:pPr>
-      <w:r>
-        <w:rPr>
-          <w:rFonts w:ascii="楷体" w:eastAsia="楷体" w:hAnsi="楷体" w:hint="eastAsia"/>
-          <w:sz w:val="24"/>
-          <w:szCs w:val="24"/>
-          <w:shd w:val="pct15" w:color="auto" w:fill="FFFFFF"/>
-        </w:rPr>
         <w:t xml:space="preserve">　　佛告弥勒。汝言是也。若有慈敬于佛者实为大善。天下久久乃复有佛。今我于此世作佛。演说经法宣布道教。断诸疑网。拔爱欲之本。杜众恶之源。游步三界无所拘阂。典揽智慧众道之要。执持纲维昭然分明。开示五趣度未度者。决正生死泥洹之道。弥勒当知。汝从无数劫来修菩萨行。欲度众生其已久远。从汝得道至于泥洹不可称数。汝及十方诸天人民一切四众。永劫已来展转五道。忧畏勤苦不可具言。乃至今世生死不绝。与佛相值听受经法。又复得闻无量寿佛。快哉甚善吾助尔喜。汝今亦可自厌生死老病痛苦恶露不净无可乐者。宜自决断端身正行益作诸善。修己洁体洗除心垢。言行忠信表里相应。人能自度转相拯济。精明求愿积累善本。虽一世勤苦，须臾之间，后生无量寿佛国快乐无极。长与道德合明。永拔生死根本。无复贪恚愚痴苦恼之患。欲寿一劫百劫千亿万劫。自在随意皆可得之。无为自然。次于泥洹之道。汝等宜各精进求心所愿。无得疑惑中悔、自为过咎。生彼边地七宝宫殿。五百岁中受诸厄也。</w:t>
       </w:r>
     </w:p>
@@ -3723,7 +4119,7 @@
           <w:szCs w:val="24"/>
           <w:shd w:val="pct15" w:color="auto" w:fill="FFFFFF"/>
         </w:rPr>
-        <w:t xml:space="preserve">　　佛言。其二恶者。世间人民父子兄弟室家夫妇。都无义理不顺法度。奢淫憍纵各欲快意。任心自恣更相欺惑。心口各异言念无实。佞谄不忠。巧言谀媚。嫉贤谤善。陷入怨枉。主上不明任用臣下。臣下自在机伪多端。践度能行知其形势。在位不正为其所欺。妄损忠良不当天心。臣欺其君。子欺其父。兄弟夫妇中外知识更相欺诳。各怀贪欲嗔恚愚痴。欲自厚己。欲贪多有。尊卑上下心俱同然。破家亡身不顾前后。亲属内外坐之灭族。或时室家知识乡党市里愚民野人。转共从事更相剥害。忿成怨结。富有悭惜不肯施与。爱保贪重心劳身苦。如是至竟无所恃怙。独来独去无一随者。善恶祸福追命所生。或在乐处或入苦毒。然后乃悔当复何及。世间人民心愚少智。见善憎谤不思慕及。但欲为恶妄作非法。常怀盗心悕望他利。消散磨尽而复求索。邪心不正惧人有色。不豫思计事至乃悔。今世现有王法牢狱。随罪趣向受其殃罚。因其前世不信道德不修善本。今复为恶，天神克识，别其名籍。寿终神逝下入恶道。故有自然三涂无量苦恼。展转其中。世世累劫无有出期。难得解脱痛不可言。是为二大恶二痛二烧。勤苦如是。譬如大火</w:t>
+        <w:t xml:space="preserve">　　佛言。其二恶者。世间人民父子兄弟室家夫妇。都无义理不顺法度。奢淫憍纵各欲快意。任心自恣更相欺惑。心口各异言念无实。佞谄不忠。巧言谀媚。嫉贤谤善。陷入怨枉。主上不明任用臣下。臣下自在机伪多端。践度能行知其形势。在位不正为其所欺。妄损忠良不当天心。臣欺其君。子欺其父。兄弟夫妇中外知识更相欺诳。各怀贪欲嗔恚愚痴。欲自厚己。欲贪多有。尊卑上下心俱同然。破家亡身不顾前后。亲属内外坐之灭族。或时室家知识乡党市里愚民野人。转共从事更相剥害。忿成怨结。富有悭惜不肯施与。爱保贪重心劳身苦。如是至竟无所恃怙。独来独去无一随者。善恶祸福追命所生。或在乐处或入苦毒。然后乃悔当复何及。世间人民心愚少智。见善憎谤不思慕及。但欲为恶妄作非法。常怀盗心悕望他利。消散磨尽而复求索。邪心不正惧人有色。不豫思计事至乃悔。今世现有王法牢狱。随罪趣向受其殃罚。因其前世不信道德不修善本。今复为恶，天神克识，别其名籍。寿终神逝下入恶道。故有自然三涂无量苦恼。展转其中。世世累劫无有出期。难得解脱痛不可言。是为二大恶二痛二烧。勤苦如是。譬如大火焚烧人身。人能于中一心制意。端身正行独作诸善。不为众恶者。身独度脱。获</w:t>
       </w:r>
       <w:r>
         <w:rPr>
@@ -3733,7 +4129,7 @@
           <w:shd w:val="pct15" w:color="auto" w:fill="FFFFFF"/>
         </w:rPr>
         <w:lastRenderedPageBreak/>
-        <w:t>焚烧人身。人能于中一心制意。端身正行独作诸善。不为众恶者。身独度脱。获其福德度世上天泥洹之道。是为二大善也。</w:t>
+        <w:t>其福德度世上天泥洹之道。是为二大善也。</w:t>
       </w:r>
     </w:p>
     <w:p>
@@ -3809,7 +4205,7 @@
           <w:szCs w:val="24"/>
           <w:shd w:val="pct15" w:color="auto" w:fill="FFFFFF"/>
         </w:rPr>
-        <w:t xml:space="preserve">　　佛告弥勒。吾语汝等是世五恶勤苦若此。五痛五烧展转相生。但作众恶不修善本。皆悉自然入诸恶趣。或其今世先被殃病。求死不得求生不得。罪恶所招示</w:t>
+        <w:t xml:space="preserve">　　佛告弥勒。吾语汝等是世五恶勤苦若此。五痛五烧展转相生。但作众恶不修善本。皆悉自然入诸恶趣。或其今世先被殃病。求死不得求生不得。罪恶所招示众见之。身死随行入三恶道。苦毒无量自相燋然。至其久后共作怨结。从小微起</w:t>
       </w:r>
       <w:r>
         <w:rPr>
@@ -3819,7 +4215,7 @@
           <w:shd w:val="pct15" w:color="auto" w:fill="FFFFFF"/>
         </w:rPr>
         <w:lastRenderedPageBreak/>
-        <w:t>众见之。身死随行入三恶道。苦毒无量自相燋然。至其久后共作怨结。从小微起遂成大恶。皆由贪著财色不能施慧。痴欲所迫随心思想。烦恼结缚无有解已。厚己诤利无所省录。富贵荣华当时快意。不能忍辱不务修善。威势无几随以磨灭。身生劳苦久后大剧。天道施张自然纠举。纲纪罗网上下相应。茕茕忪忪当入其中。古今有是痛哉可伤。</w:t>
+        <w:t>遂成大恶。皆由贪著财色不能施慧。痴欲所迫随心思想。烦恼结缚无有解已。厚己诤利无所省录。富贵荣华当时快意。不能忍辱不务修善。威势无几随以磨灭。身生劳苦久后大剧。天道施张自然纠举。纲纪罗网上下相应。茕茕忪忪当入其中。古今有是痛哉可伤。</w:t>
       </w:r>
     </w:p>
     <w:p>
@@ -4142,8 +4538,18 @@
           <w:szCs w:val="24"/>
           <w:shd w:val="pct15" w:color="auto" w:fill="FFFFFF"/>
         </w:rPr>
-        <w:t xml:space="preserve">　　其胎生者所处宫殿。或百由旬或五百由旬。各于其中受诸快乐。如忉利天亦</w:t>
-      </w:r>
+        <w:t xml:space="preserve">　　其胎生者所处宫殿。或百由旬或五百由旬。各于其中受诸快乐。如忉利天亦皆自然。</w:t>
+      </w:r>
+    </w:p>
+    <w:p>
+      <w:pPr>
+        <w:rPr>
+          <w:rFonts w:ascii="楷体" w:eastAsia="楷体" w:hAnsi="楷体"/>
+          <w:sz w:val="24"/>
+          <w:szCs w:val="24"/>
+          <w:shd w:val="pct15" w:color="auto" w:fill="FFFFFF"/>
+        </w:rPr>
+      </w:pPr>
       <w:r>
         <w:rPr>
           <w:rFonts w:ascii="楷体" w:eastAsia="楷体" w:hAnsi="楷体" w:hint="eastAsia"/>
@@ -4152,25 +4558,6 @@
           <w:shd w:val="pct15" w:color="auto" w:fill="FFFFFF"/>
         </w:rPr>
         <w:lastRenderedPageBreak/>
-        <w:t>皆自然。</w:t>
-      </w:r>
-    </w:p>
-    <w:p>
-      <w:pPr>
-        <w:rPr>
-          <w:rFonts w:ascii="楷体" w:eastAsia="楷体" w:hAnsi="楷体"/>
-          <w:sz w:val="24"/>
-          <w:szCs w:val="24"/>
-          <w:shd w:val="pct15" w:color="auto" w:fill="FFFFFF"/>
-        </w:rPr>
-      </w:pPr>
-      <w:r>
-        <w:rPr>
-          <w:rFonts w:ascii="楷体" w:eastAsia="楷体" w:hAnsi="楷体" w:hint="eastAsia"/>
-          <w:sz w:val="24"/>
-          <w:szCs w:val="24"/>
-          <w:shd w:val="pct15" w:color="auto" w:fill="FFFFFF"/>
-        </w:rPr>
         <w:t xml:space="preserve">　　尔时慈氏菩萨白佛言。世尊。何因何缘。彼国人民胎生化生。</w:t>
       </w:r>
     </w:p>
@@ -4361,7 +4748,7 @@
           <w:szCs w:val="24"/>
           <w:shd w:val="pct15" w:color="auto" w:fill="FFFFFF"/>
         </w:rPr>
-        <w:t xml:space="preserve">　　佛语弥勒。其有得闻彼佛名号。欢喜踊跃乃至一念。当知此人为得大利。则是具足无上功德。是故弥勒。设有大火充满三千大千世界。要当过此。闻是经法欢喜信乐。受持读诵如说修行。所以者何。多有菩萨欲闻此经而不能得。若有众生闻此经者。于无上道终不退转。是故应当专心信受持诵说行。吾今为诸众生说此经法。令见无量寿佛及其国土一切所有。所当为者皆可求之。无得以我灭度之</w:t>
+        <w:t xml:space="preserve">　　佛语弥勒。其有得闻彼佛名号。欢喜踊跃乃至一念。当知此人为得大利。则是具足无上功德。是故弥勒。设有大火充满三千大千世界。要当过此。闻是经法欢喜信乐。受持读诵如说修行。所以者何。多有菩萨欲闻此经而不能得。若有众生闻此经者。于无上道终不退转。是故应当专心信受持诵说行。吾今为诸众生说此经法。令见无量寿佛及其国土一切所有。所当为者皆可求之。无得以我灭度之后复生疑惑。当来之世经道灭尽。我以慈悲哀愍特留此经止住百岁。其有众生值</w:t>
       </w:r>
       <w:r>
         <w:rPr>
@@ -4371,7 +4758,7 @@
           <w:shd w:val="pct15" w:color="auto" w:fill="FFFFFF"/>
         </w:rPr>
         <w:lastRenderedPageBreak/>
-        <w:t>后复生疑惑。当来之世经道灭尽。我以慈悲哀愍特留此经止住百岁。其有众生值斯经者。随意所愿皆可得度。</w:t>
+        <w:t>斯经者。随意所愿皆可得度。</w:t>
       </w:r>
     </w:p>
     <w:p>

</xml_diff>